<commit_message>
Caricato paper consumi bus e pdf rapido con i relativi grafici
</commit_message>
<xml_diff>
--- a/cose da fare.docx
+++ b/cose da fare.docx
@@ -13,12 +13,14 @@
         <w:ind w:right="0"/>
         <w:jc w:val="left"/>
         <w:rPr>
+          <w:rFonts w:ascii="Arial" w:hAnsi="Arial"/>
           <w:rtl w:val="0"/>
           <w:lang w:val="it-IT"/>
         </w:rPr>
       </w:pPr>
       <w:r>
         <w:rPr>
+          <w:rFonts w:ascii="Arial" w:hAnsi="Arial"/>
           <w:rtl w:val="0"/>
           <w:lang w:val="it-IT"/>
         </w:rPr>
@@ -36,27 +38,22 @@
         <w:ind w:right="0"/>
         <w:jc w:val="left"/>
         <w:rPr>
+          <w:rFonts w:ascii="Arial" w:hAnsi="Arial" w:hint="default"/>
           <w:rtl w:val="0"/>
           <w:lang w:val="it-IT"/>
         </w:rPr>
       </w:pPr>
       <w:r>
         <w:rPr>
-          <w:rtl w:val="0"/>
-          <w:lang w:val="it-IT"/>
-        </w:rPr>
-        <w:t xml:space="preserve">  </w:t>
+          <w:rFonts w:ascii="Arial" w:hAnsi="Arial" w:hint="default"/>
+          <w:rtl w:val="0"/>
+          <w:lang w:val="it-IT"/>
+        </w:rPr>
+        <w:t xml:space="preserve">  ⁠⁠</w:t>
       </w:r>
       <w:r>
         <w:rPr>
-          <w:rFonts w:ascii="Segoe UI Symbol" w:cs="Segoe UI Symbol" w:hAnsi="Segoe UI Symbol" w:eastAsia="Segoe UI Symbol"/>
-          <w:rtl w:val="0"/>
-          <w:lang w:val="it-IT"/>
-        </w:rPr>
-        <w:t>⁠⁠</w:t>
-      </w:r>
-      <w:r>
-        <w:rPr>
+          <w:rFonts w:ascii="Arial" w:hAnsi="Arial"/>
           <w:rtl w:val="0"/>
           <w:lang w:val="it-IT"/>
         </w:rPr>
@@ -64,6 +61,7 @@
       </w:r>
       <w:r>
         <w:rPr>
+          <w:rFonts w:ascii="Arial" w:hAnsi="Arial" w:hint="default"/>
           <w:rtl w:val="0"/>
           <w:lang w:val="it-IT"/>
         </w:rPr>
@@ -71,6 +69,7 @@
       </w:r>
       <w:r>
         <w:rPr>
+          <w:rFonts w:ascii="Arial" w:hAnsi="Arial"/>
           <w:rtl w:val="0"/>
           <w:lang w:val="it-IT"/>
         </w:rPr>
@@ -88,27 +87,22 @@
         <w:ind w:right="0"/>
         <w:jc w:val="left"/>
         <w:rPr>
+          <w:rFonts w:ascii="Arial" w:hAnsi="Arial" w:hint="default"/>
           <w:rtl w:val="0"/>
           <w:lang w:val="it-IT"/>
         </w:rPr>
       </w:pPr>
       <w:r>
         <w:rPr>
-          <w:rtl w:val="0"/>
-          <w:lang w:val="it-IT"/>
-        </w:rPr>
-        <w:t xml:space="preserve">  </w:t>
+          <w:rFonts w:ascii="Arial" w:hAnsi="Arial" w:hint="default"/>
+          <w:rtl w:val="0"/>
+          <w:lang w:val="it-IT"/>
+        </w:rPr>
+        <w:t xml:space="preserve">  ⁠⁠</w:t>
       </w:r>
       <w:r>
         <w:rPr>
-          <w:rFonts w:ascii="Segoe UI Symbol" w:cs="Segoe UI Symbol" w:hAnsi="Segoe UI Symbol" w:eastAsia="Segoe UI Symbol"/>
-          <w:rtl w:val="0"/>
-          <w:lang w:val="it-IT"/>
-        </w:rPr>
-        <w:t>⁠⁠</w:t>
-      </w:r>
-      <w:r>
-        <w:rPr>
+          <w:rFonts w:ascii="Arial" w:hAnsi="Arial"/>
           <w:rtl w:val="0"/>
           <w:lang w:val="it-IT"/>
         </w:rPr>
@@ -126,27 +120,22 @@
         <w:ind w:right="0"/>
         <w:jc w:val="left"/>
         <w:rPr>
+          <w:rFonts w:ascii="Arial" w:hAnsi="Arial" w:hint="default"/>
           <w:rtl w:val="0"/>
           <w:lang w:val="it-IT"/>
         </w:rPr>
       </w:pPr>
       <w:r>
         <w:rPr>
-          <w:rtl w:val="0"/>
-          <w:lang w:val="it-IT"/>
-        </w:rPr>
-        <w:t xml:space="preserve">  </w:t>
+          <w:rFonts w:ascii="Arial" w:hAnsi="Arial" w:hint="default"/>
+          <w:rtl w:val="0"/>
+          <w:lang w:val="it-IT"/>
+        </w:rPr>
+        <w:t xml:space="preserve">  ⁠⁠</w:t>
       </w:r>
       <w:r>
         <w:rPr>
-          <w:rFonts w:ascii="Segoe UI Symbol" w:cs="Segoe UI Symbol" w:hAnsi="Segoe UI Symbol" w:eastAsia="Segoe UI Symbol"/>
-          <w:rtl w:val="0"/>
-          <w:lang w:val="it-IT"/>
-        </w:rPr>
-        <w:t>⁠⁠</w:t>
-      </w:r>
-      <w:r>
-        <w:rPr>
+          <w:rFonts w:ascii="Arial" w:hAnsi="Arial"/>
           <w:rtl w:val="0"/>
           <w:lang w:val="it-IT"/>
         </w:rPr>
@@ -164,35 +153,22 @@
         <w:ind w:right="0"/>
         <w:jc w:val="left"/>
         <w:rPr>
+          <w:rFonts w:ascii="Arial" w:hAnsi="Arial" w:hint="default"/>
           <w:rtl w:val="0"/>
           <w:lang w:val="it-IT"/>
         </w:rPr>
       </w:pPr>
       <w:r>
         <w:rPr>
-          <w:rFonts w:ascii="Segoe UI Symbol" w:cs="Segoe UI Symbol" w:hAnsi="Segoe UI Symbol" w:eastAsia="Segoe UI Symbol"/>
-          <w:rtl w:val="0"/>
-          <w:lang w:val="it-IT"/>
-        </w:rPr>
-        <w:t>⁠</w:t>
+          <w:rFonts w:ascii="Arial" w:hAnsi="Arial" w:hint="default"/>
+          <w:rtl w:val="0"/>
+          <w:lang w:val="it-IT"/>
+        </w:rPr>
+        <w:t>⁠  ⁠⁠</w:t>
       </w:r>
       <w:r>
         <w:rPr>
-          <w:rtl w:val="0"/>
-          <w:lang w:val="it-IT"/>
-        </w:rPr>
-        <w:t xml:space="preserve">  </w:t>
-      </w:r>
-      <w:r>
-        <w:rPr>
-          <w:rFonts w:ascii="Segoe UI Symbol" w:cs="Segoe UI Symbol" w:hAnsi="Segoe UI Symbol" w:eastAsia="Segoe UI Symbol"/>
-          <w:rtl w:val="0"/>
-          <w:lang w:val="it-IT"/>
-        </w:rPr>
-        <w:t>⁠⁠</w:t>
-      </w:r>
-      <w:r>
-        <w:rPr>
+          <w:rFonts w:ascii="Arial" w:hAnsi="Arial"/>
           <w:rtl w:val="0"/>
           <w:lang w:val="it-IT"/>
         </w:rPr>
@@ -210,12 +186,14 @@
         <w:ind w:right="0"/>
         <w:jc w:val="left"/>
         <w:rPr>
+          <w:rFonts w:ascii="Arial" w:hAnsi="Arial"/>
           <w:rtl w:val="0"/>
           <w:lang w:val="it-IT"/>
         </w:rPr>
       </w:pPr>
       <w:r>
         <w:rPr>
+          <w:rFonts w:ascii="Arial" w:hAnsi="Arial"/>
           <w:rtl w:val="0"/>
           <w:lang w:val="it-IT"/>
         </w:rPr>
@@ -223,6 +201,7 @@
       </w:r>
       <w:r>
         <w:rPr>
+          <w:rFonts w:ascii="Arial" w:hAnsi="Arial" w:hint="default"/>
           <w:rtl w:val="0"/>
           <w:lang w:val="it-IT"/>
         </w:rPr>
@@ -230,6 +209,7 @@
       </w:r>
       <w:r>
         <w:rPr>
+          <w:rFonts w:ascii="Arial" w:hAnsi="Arial"/>
           <w:rtl w:val="0"/>
           <w:lang w:val="it-IT"/>
         </w:rPr>
@@ -247,12 +227,14 @@
         <w:ind w:right="0"/>
         <w:jc w:val="left"/>
         <w:rPr>
+          <w:rFonts w:ascii="Arial" w:hAnsi="Arial"/>
           <w:rtl w:val="0"/>
           <w:lang w:val="it-IT"/>
         </w:rPr>
       </w:pPr>
       <w:r>
         <w:rPr>
+          <w:rFonts w:ascii="Arial" w:hAnsi="Arial"/>
           <w:rtl w:val="0"/>
           <w:lang w:val="it-IT"/>
         </w:rPr>
@@ -270,12 +252,14 @@
         <w:ind w:right="0"/>
         <w:jc w:val="left"/>
         <w:rPr>
+          <w:rFonts w:ascii="Arial" w:hAnsi="Arial"/>
           <w:rtl w:val="0"/>
           <w:lang w:val="it-IT"/>
         </w:rPr>
       </w:pPr>
       <w:r>
         <w:rPr>
+          <w:rFonts w:ascii="Arial" w:hAnsi="Arial"/>
           <w:rtl w:val="0"/>
           <w:lang w:val="it-IT"/>
         </w:rPr>
@@ -283,6 +267,7 @@
       </w:r>
       <w:r>
         <w:rPr>
+          <w:rFonts w:ascii="Arial" w:hAnsi="Arial" w:hint="default"/>
           <w:rtl w:val="0"/>
           <w:lang w:val="it-IT"/>
         </w:rPr>
@@ -290,6 +275,7 @@
       </w:r>
       <w:r>
         <w:rPr>
+          <w:rFonts w:ascii="Arial" w:hAnsi="Arial"/>
           <w:rtl w:val="0"/>
           <w:lang w:val="it-IT"/>
         </w:rPr>

</xml_diff>